<commit_message>
Drug Hunter: tighten resume to one page
Co-Authored-By: Claude Opus 5.5 <noreply@anthropic.com>
Claude-Session: https://claude.ai/code/session_01XE6aV5LP3W9C1iWzBfgedS
</commit_message>
<xml_diff>
--- a/applications/drug-hunter-marketing-specialist/DrugHunter-MarketingSpecialist-Resume.docx
+++ b/applications/drug-hunter-marketing-specialist/DrugHunter-MarketingSpecialist-Resume.docx
@@ -254,30 +254,6 @@
     </w:p>
     <w:p>
       <w:pPr>
-        <w:spacing w:after="30"/>
-        <w:ind w:left="259" w:hanging="259"/>
-      </w:pPr>
-      <w:r>
-        <w:rPr>
-          <w:rFonts w:ascii="Calibri" w:hAnsi="Calibri"/>
-          <w:b w:val="0"/>
-          <w:i w:val="0"/>
-          <w:color w:val="163A5F"/>
-        </w:rPr>
-        <w:t xml:space="preserve">•  </w:t>
-      </w:r>
-      <w:r>
-        <w:rPr>
-          <w:rFonts w:ascii="Calibri" w:hAnsi="Calibri"/>
-          <w:b w:val="0"/>
-          <w:i w:val="0"/>
-          <w:color w:val="1A1A1A"/>
-        </w:rPr>
-        <w:t>Manage timelines, deliverables, and documentation across concurrent client campaigns in Notion and the CRM.</w:t>
-      </w:r>
-    </w:p>
-    <w:p>
-      <w:pPr>
         <w:tabs>
           <w:tab w:pos="10512" w:val="right"/>
         </w:tabs>
@@ -376,30 +352,6 @@
           <w:color w:val="1A1A1A"/>
         </w:rPr>
         <w:t>Ran A/B-tested LinkedIn campaigns against small, highly researched B2B audiences, and built reporting on ROI, CAC, and conversion.</w:t>
-      </w:r>
-    </w:p>
-    <w:p>
-      <w:pPr>
-        <w:spacing w:after="30"/>
-        <w:ind w:left="259" w:hanging="259"/>
-      </w:pPr>
-      <w:r>
-        <w:rPr>
-          <w:rFonts w:ascii="Calibri" w:hAnsi="Calibri"/>
-          <w:b w:val="0"/>
-          <w:i w:val="0"/>
-          <w:color w:val="163A5F"/>
-        </w:rPr>
-        <w:t xml:space="preserve">•  </w:t>
-      </w:r>
-      <w:r>
-        <w:rPr>
-          <w:rFonts w:ascii="Calibri" w:hAnsi="Calibri"/>
-          <w:b w:val="0"/>
-          <w:i w:val="0"/>
-          <w:color w:val="1A1A1A"/>
-        </w:rPr>
-        <w:t>Managed HubSpot-based client accounts and presented results and next steps in QBRs.</w:t>
       </w:r>
     </w:p>
     <w:p>
@@ -638,30 +590,6 @@
     </w:p>
     <w:p>
       <w:pPr>
-        <w:spacing w:after="30"/>
-        <w:ind w:left="259" w:hanging="259"/>
-      </w:pPr>
-      <w:r>
-        <w:rPr>
-          <w:rFonts w:ascii="Calibri" w:hAnsi="Calibri"/>
-          <w:b w:val="0"/>
-          <w:i w:val="0"/>
-          <w:color w:val="163A5F"/>
-        </w:rPr>
-        <w:t xml:space="preserve">•  </w:t>
-      </w:r>
-      <w:r>
-        <w:rPr>
-          <w:rFonts w:ascii="Calibri" w:hAnsi="Calibri"/>
-          <w:b w:val="0"/>
-          <w:i w:val="0"/>
-          <w:color w:val="1A1A1A"/>
-        </w:rPr>
-        <w:t>Advised on content, SEO, and site architecture, contributing to a 30% traffic increase and 25% conversion improvement across the e-commerce segment.</w:t>
-      </w:r>
-    </w:p>
-    <w:p>
-      <w:pPr>
         <w:spacing w:before="140" w:after="60"/>
         <w:pBdr>
           <w:bottom w:val="single" w:sz="6" w:space="2" w:color="163a5f"/>
@@ -699,7 +627,7 @@
           <w:i w:val="0"/>
           <w:color w:val="1A1A1A"/>
         </w:rPr>
-        <w:t>Content Calendars, LinkedIn Content, Email &amp; Newsletters, Segmentation &amp; Lead Management, Campaign Tracking, Product Launch Coordination, Sales Enablement Assets</w:t>
+        <w:t>Content Calendars, LinkedIn Content, Email &amp; Newsletters, Segmentation &amp; Lead Management, Campaign Tracking, Product Launch Coordination, Sales Enablement Assets, Timelines &amp; Documentation</w:t>
       </w:r>
     </w:p>
     <w:p>
@@ -723,29 +651,6 @@
           <w:color w:val="1A1A1A"/>
         </w:rPr>
         <w:t>HubSpot (7 yrs), Notion, Monday.com, ClickUp, Google Workspace, Microsoft Office, GA4 &amp; GTM, Mailchimp</w:t>
-      </w:r>
-    </w:p>
-    <w:p>
-      <w:pPr>
-        <w:spacing w:after="30"/>
-      </w:pPr>
-      <w:r>
-        <w:rPr>
-          <w:rFonts w:ascii="Calibri" w:hAnsi="Calibri"/>
-          <w:b/>
-          <w:i w:val="0"/>
-          <w:color w:val="1A1A1A"/>
-        </w:rPr>
-        <w:t xml:space="preserve">Project Management:  </w:t>
-      </w:r>
-      <w:r>
-        <w:rPr>
-          <w:rFonts w:ascii="Calibri" w:hAnsi="Calibri"/>
-          <w:b w:val="0"/>
-          <w:i w:val="0"/>
-          <w:color w:val="1A1A1A"/>
-        </w:rPr>
-        <w:t>Timelines &amp; Deliverables, Cross-Functional Coordination, Documentation, Multiple Concurrent Campaigns</w:t>
       </w:r>
     </w:p>
     <w:p>

</xml_diff>

<commit_message>
Drug Hunter: one-page resume
Co-Authored-By: Claude Opus 5.5 <noreply@anthropic.com>
Claude-Session: https://claude.ai/code/session_01XE6aV5LP3W9C1iWzBfgedS
</commit_message>
<xml_diff>
--- a/applications/drug-hunter-marketing-specialist/DrugHunter-MarketingSpecialist-Resume.docx
+++ b/applications/drug-hunter-marketing-specialist/DrugHunter-MarketingSpecialist-Resume.docx
@@ -80,7 +80,7 @@
           <w:i w:val="0"/>
           <w:color w:val="1A1A1A"/>
         </w:rPr>
-        <w:t>Hands-on B2B marketer with 15+ years across SaaS, agency, and marketing operations, and 7 years in HubSpot. Plans and ships the work end to end: LinkedIn content and calendars, email and newsletter programs, segmentation and lead management, tracking, and the reporting that shows what to change. Grew Solenzo's audience through organic LinkedIn content into a free-audit funnel that enrolled 180+ businesses. Keeps multiple campaigns on schedule across creative, sales, and subject-matter teams, and translates technical material into content a busy expert will actually read.</w:t>
+        <w:t>Hands-on B2B marketer with 15+ years across SaaS, agency, and marketing operations, and 7 years in HubSpot. Plans and ships the work end to end: LinkedIn content and calendars, email and newsletter programs, segmentation, tracking, and reporting. Grew Solenzo's audience through organic LinkedIn content into a free-audit funnel that enrolled 180+ businesses, and turns technical material into content a busy expert will actually read.</w:t>
       </w:r>
     </w:p>
     <w:p>
@@ -719,20 +719,6 @@
         <w:t>Google Digital Marketing &amp; E-Commerce Professional Certificate - Google / Coursera (Sept 2024)</w:t>
       </w:r>
     </w:p>
-    <w:p>
-      <w:pPr>
-        <w:spacing w:after="30"/>
-      </w:pPr>
-      <w:r>
-        <w:rPr>
-          <w:rFonts w:ascii="Calibri" w:hAnsi="Calibri"/>
-          <w:b w:val="0"/>
-          <w:i w:val="0"/>
-          <w:color w:val="1A1A1A"/>
-        </w:rPr>
-        <w:t>Meta Ads Certification - Meta</w:t>
-      </w:r>
-    </w:p>
     <w:sectPr>
       <w:pgSz w:w="12240" w:h="15840"/>
       <w:pgMar w:top="720" w:right="864" w:bottom="720" w:left="864" w:header="720" w:footer="720" w:gutter="0"/>

</xml_diff>

<commit_message>
Drug Hunter: two-page resume with Accelo and Fivestars; CLAUDE.md: resumes are always two pages
Co-Authored-By: Claude Opus 5.5 <noreply@anthropic.com>
Claude-Session: https://claude.ai/code/session_01XE6aV5LP3W9C1iWzBfgedS
</commit_message>
<xml_diff>
--- a/applications/drug-hunter-marketing-specialist/DrugHunter-MarketingSpecialist-Resume.docx
+++ b/applications/drug-hunter-marketing-specialist/DrugHunter-MarketingSpecialist-Resume.docx
@@ -80,7 +80,7 @@
           <w:i w:val="0"/>
           <w:color w:val="1A1A1A"/>
         </w:rPr>
-        <w:t>Hands-on B2B marketer with 15+ years across SaaS, agency, and marketing operations, and 7 years in HubSpot. Plans and ships the work end to end: LinkedIn content and calendars, email and newsletter programs, segmentation, tracking, and reporting. Grew Solenzo's audience through organic LinkedIn content into a free-audit funnel that enrolled 180+ businesses, and turns technical material into content a busy expert will actually read.</w:t>
+        <w:t>Hands-on B2B marketer with 15+ years across SaaS, agency, and marketing operations, and 7 years in HubSpot. Plans and ships the work end to end: LinkedIn content and calendars, email and newsletter programs, segmentation and lead management, tracking, and the reporting that shows what to change. Grew Solenzo's audience through organic LinkedIn content into a free-audit funnel that enrolled 180+ businesses. Keeps multiple campaigns on schedule across creative, sales, and subject-matter teams, and translates technical material into content a busy expert will actually read.</w:t>
       </w:r>
     </w:p>
     <w:p>
@@ -254,6 +254,30 @@
     </w:p>
     <w:p>
       <w:pPr>
+        <w:spacing w:after="30"/>
+        <w:ind w:left="259" w:hanging="259"/>
+      </w:pPr>
+      <w:r>
+        <w:rPr>
+          <w:rFonts w:ascii="Calibri" w:hAnsi="Calibri"/>
+          <w:b w:val="0"/>
+          <w:i w:val="0"/>
+          <w:color w:val="163A5F"/>
+        </w:rPr>
+        <w:t xml:space="preserve">•  </w:t>
+      </w:r>
+      <w:r>
+        <w:rPr>
+          <w:rFonts w:ascii="Calibri" w:hAnsi="Calibri"/>
+          <w:b w:val="0"/>
+          <w:i w:val="0"/>
+          <w:color w:val="1A1A1A"/>
+        </w:rPr>
+        <w:t>Manage timelines, deliverables, and documentation across concurrent client campaigns in Notion and the CRM.</w:t>
+      </w:r>
+    </w:p>
+    <w:p>
+      <w:pPr>
         <w:tabs>
           <w:tab w:pos="10512" w:val="right"/>
         </w:tabs>
@@ -352,6 +376,30 @@
           <w:color w:val="1A1A1A"/>
         </w:rPr>
         <w:t>Ran A/B-tested LinkedIn campaigns against small, highly researched B2B audiences, and built reporting on ROI, CAC, and conversion.</w:t>
+      </w:r>
+    </w:p>
+    <w:p>
+      <w:pPr>
+        <w:spacing w:after="30"/>
+        <w:ind w:left="259" w:hanging="259"/>
+      </w:pPr>
+      <w:r>
+        <w:rPr>
+          <w:rFonts w:ascii="Calibri" w:hAnsi="Calibri"/>
+          <w:b w:val="0"/>
+          <w:i w:val="0"/>
+          <w:color w:val="163A5F"/>
+        </w:rPr>
+        <w:t xml:space="preserve">•  </w:t>
+      </w:r>
+      <w:r>
+        <w:rPr>
+          <w:rFonts w:ascii="Calibri" w:hAnsi="Calibri"/>
+          <w:b w:val="0"/>
+          <w:i w:val="0"/>
+          <w:color w:val="1A1A1A"/>
+        </w:rPr>
+        <w:t>Managed HubSpot-based client accounts and presented results and next steps in QBRs.</w:t>
       </w:r>
     </w:p>
     <w:p>
@@ -590,6 +638,210 @@
     </w:p>
     <w:p>
       <w:pPr>
+        <w:spacing w:after="30"/>
+        <w:ind w:left="259" w:hanging="259"/>
+      </w:pPr>
+      <w:r>
+        <w:rPr>
+          <w:rFonts w:ascii="Calibri" w:hAnsi="Calibri"/>
+          <w:b w:val="0"/>
+          <w:i w:val="0"/>
+          <w:color w:val="163A5F"/>
+        </w:rPr>
+        <w:t xml:space="preserve">•  </w:t>
+      </w:r>
+      <w:r>
+        <w:rPr>
+          <w:rFonts w:ascii="Calibri" w:hAnsi="Calibri"/>
+          <w:b w:val="0"/>
+          <w:i w:val="0"/>
+          <w:color w:val="1A1A1A"/>
+        </w:rPr>
+        <w:t>Advised on content, SEO, and site architecture, contributing to a 30% traffic increase and 25% conversion improvement across the e-commerce segment.</w:t>
+      </w:r>
+    </w:p>
+    <w:p>
+      <w:pPr>
+        <w:tabs>
+          <w:tab w:pos="10512" w:val="right"/>
+        </w:tabs>
+        <w:spacing w:before="80" w:after="20"/>
+      </w:pPr>
+      <w:r>
+        <w:rPr>
+          <w:rFonts w:ascii="Calibri" w:hAnsi="Calibri"/>
+          <w:b/>
+          <w:i w:val="0"/>
+          <w:color w:val="1A1A1A"/>
+          <w:sz w:val="21"/>
+        </w:rPr>
+        <w:t>Account Executive</w:t>
+      </w:r>
+      <w:r>
+        <w:rPr>
+          <w:rFonts w:ascii="Calibri" w:hAnsi="Calibri"/>
+          <w:b w:val="0"/>
+          <w:i w:val="0"/>
+          <w:color w:val="163A5F"/>
+          <w:sz w:val="21"/>
+        </w:rPr>
+        <w:t xml:space="preserve">  |  Accelo</w:t>
+      </w:r>
+      <w:r>
+        <w:rPr>
+          <w:rFonts w:ascii="Calibri" w:hAnsi="Calibri"/>
+          <w:b w:val="0"/>
+          <w:i w:val="0"/>
+          <w:color w:val="555555"/>
+          <w:sz w:val="18"/>
+        </w:rPr>
+        <w:tab/>
+        <w:t>Apr 2018 - Jul 2020</w:t>
+      </w:r>
+    </w:p>
+    <w:p>
+      <w:pPr>
+        <w:spacing w:after="20"/>
+      </w:pPr>
+      <w:r>
+        <w:rPr>
+          <w:rFonts w:ascii="Calibri" w:hAnsi="Calibri"/>
+          <w:b w:val="0"/>
+          <w:i/>
+          <w:color w:val="555555"/>
+          <w:sz w:val="18"/>
+        </w:rPr>
+        <w:t>Denver, CO</w:t>
+      </w:r>
+    </w:p>
+    <w:p>
+      <w:pPr>
+        <w:spacing w:after="30"/>
+        <w:ind w:left="259" w:hanging="259"/>
+      </w:pPr>
+      <w:r>
+        <w:rPr>
+          <w:rFonts w:ascii="Calibri" w:hAnsi="Calibri"/>
+          <w:b w:val="0"/>
+          <w:i w:val="0"/>
+          <w:color w:val="163A5F"/>
+        </w:rPr>
+        <w:t xml:space="preserve">•  </w:t>
+      </w:r>
+      <w:r>
+        <w:rPr>
+          <w:rFonts w:ascii="Calibri" w:hAnsi="Calibri"/>
+          <w:b w:val="0"/>
+          <w:i w:val="0"/>
+          <w:color w:val="1A1A1A"/>
+        </w:rPr>
+        <w:t>Sold CRM and project-management SaaS to agencies and professional-services firms, explaining a technical product in terms of each buyer's workflow and outcomes.</w:t>
+      </w:r>
+    </w:p>
+    <w:p>
+      <w:pPr>
+        <w:spacing w:after="30"/>
+        <w:ind w:left="259" w:hanging="259"/>
+      </w:pPr>
+      <w:r>
+        <w:rPr>
+          <w:rFonts w:ascii="Calibri" w:hAnsi="Calibri"/>
+          <w:b w:val="0"/>
+          <w:i w:val="0"/>
+          <w:color w:val="163A5F"/>
+        </w:rPr>
+        <w:t xml:space="preserve">•  </w:t>
+      </w:r>
+      <w:r>
+        <w:rPr>
+          <w:rFonts w:ascii="Calibri" w:hAnsi="Calibri"/>
+          <w:b w:val="0"/>
+          <w:i w:val="0"/>
+          <w:color w:val="1A1A1A"/>
+        </w:rPr>
+        <w:t>Ranked top three in sales on a team that grew from 8 to 15 reps while quota roughly doubled, and built Zapier automations along the way.</w:t>
+      </w:r>
+    </w:p>
+    <w:p>
+      <w:pPr>
+        <w:tabs>
+          <w:tab w:pos="10512" w:val="right"/>
+        </w:tabs>
+        <w:spacing w:before="80" w:after="20"/>
+      </w:pPr>
+      <w:r>
+        <w:rPr>
+          <w:rFonts w:ascii="Calibri" w:hAnsi="Calibri"/>
+          <w:b/>
+          <w:i w:val="0"/>
+          <w:color w:val="1A1A1A"/>
+          <w:sz w:val="21"/>
+        </w:rPr>
+        <w:t>Account Executive</w:t>
+      </w:r>
+      <w:r>
+        <w:rPr>
+          <w:rFonts w:ascii="Calibri" w:hAnsi="Calibri"/>
+          <w:b w:val="0"/>
+          <w:i w:val="0"/>
+          <w:color w:val="163A5F"/>
+          <w:sz w:val="21"/>
+        </w:rPr>
+        <w:t xml:space="preserve">  |  Fivestars</w:t>
+      </w:r>
+      <w:r>
+        <w:rPr>
+          <w:rFonts w:ascii="Calibri" w:hAnsi="Calibri"/>
+          <w:b w:val="0"/>
+          <w:i w:val="0"/>
+          <w:color w:val="555555"/>
+          <w:sz w:val="18"/>
+        </w:rPr>
+        <w:tab/>
+        <w:t>2017 - 2018</w:t>
+      </w:r>
+    </w:p>
+    <w:p>
+      <w:pPr>
+        <w:spacing w:after="20"/>
+      </w:pPr>
+      <w:r>
+        <w:rPr>
+          <w:rFonts w:ascii="Calibri" w:hAnsi="Calibri"/>
+          <w:b w:val="0"/>
+          <w:i/>
+          <w:color w:val="555555"/>
+          <w:sz w:val="18"/>
+        </w:rPr>
+        <w:t>Denver, CO</w:t>
+      </w:r>
+    </w:p>
+    <w:p>
+      <w:pPr>
+        <w:spacing w:after="30"/>
+        <w:ind w:left="259" w:hanging="259"/>
+      </w:pPr>
+      <w:r>
+        <w:rPr>
+          <w:rFonts w:ascii="Calibri" w:hAnsi="Calibri"/>
+          <w:b w:val="0"/>
+          <w:i w:val="0"/>
+          <w:color w:val="163A5F"/>
+        </w:rPr>
+        <w:t xml:space="preserve">•  </w:t>
+      </w:r>
+      <w:r>
+        <w:rPr>
+          <w:rFonts w:ascii="Calibri" w:hAnsi="Calibri"/>
+          <w:b w:val="0"/>
+          <w:i w:val="0"/>
+          <w:color w:val="1A1A1A"/>
+        </w:rPr>
+        <w:t>Sold a loyalty and marketing automation platform to local businesses, building the consultative approach to adoption and retention that carried into later roles.</w:t>
+      </w:r>
+    </w:p>
+    <w:p>
+      <w:pPr>
         <w:spacing w:before="140" w:after="60"/>
         <w:pBdr>
           <w:bottom w:val="single" w:sz="6" w:space="2" w:color="163a5f"/>
@@ -627,7 +879,7 @@
           <w:i w:val="0"/>
           <w:color w:val="1A1A1A"/>
         </w:rPr>
-        <w:t>Content Calendars, LinkedIn Content, Email &amp; Newsletters, Segmentation &amp; Lead Management, Campaign Tracking, Product Launch Coordination, Sales Enablement Assets, Timelines &amp; Documentation</w:t>
+        <w:t>Content Calendars, LinkedIn Content, Email &amp; Newsletters, Segmentation &amp; Lead Management, Campaign Tracking, Product Launch Coordination, Sales Enablement Assets</w:t>
       </w:r>
     </w:p>
     <w:p>
@@ -651,6 +903,29 @@
           <w:color w:val="1A1A1A"/>
         </w:rPr>
         <w:t>HubSpot (7 yrs), Notion, Monday.com, ClickUp, Google Workspace, Microsoft Office, GA4 &amp; GTM, Mailchimp</w:t>
+      </w:r>
+    </w:p>
+    <w:p>
+      <w:pPr>
+        <w:spacing w:after="30"/>
+      </w:pPr>
+      <w:r>
+        <w:rPr>
+          <w:rFonts w:ascii="Calibri" w:hAnsi="Calibri"/>
+          <w:b/>
+          <w:i w:val="0"/>
+          <w:color w:val="1A1A1A"/>
+        </w:rPr>
+        <w:t xml:space="preserve">Project Management:  </w:t>
+      </w:r>
+      <w:r>
+        <w:rPr>
+          <w:rFonts w:ascii="Calibri" w:hAnsi="Calibri"/>
+          <w:b w:val="0"/>
+          <w:i w:val="0"/>
+          <w:color w:val="1A1A1A"/>
+        </w:rPr>
+        <w:t>Timelines &amp; Deliverables, Cross-Functional Coordination, Documentation, Multiple Concurrent Campaigns</w:t>
       </w:r>
     </w:p>
     <w:p>
@@ -717,6 +992,20 @@
           <w:color w:val="1A1A1A"/>
         </w:rPr>
         <w:t>Google Digital Marketing &amp; E-Commerce Professional Certificate - Google / Coursera (Sept 2024)</w:t>
+      </w:r>
+    </w:p>
+    <w:p>
+      <w:pPr>
+        <w:spacing w:after="30"/>
+      </w:pPr>
+      <w:r>
+        <w:rPr>
+          <w:rFonts w:ascii="Calibri" w:hAnsi="Calibri"/>
+          <w:b w:val="0"/>
+          <w:i w:val="0"/>
+          <w:color w:val="1A1A1A"/>
+        </w:rPr>
+        <w:t>Meta Ads Certification - Meta</w:t>
       </w:r>
     </w:p>
     <w:sectPr>

</xml_diff>